<commit_message>
Modified ref docx to include centered text for title page.
</commit_message>
<xml_diff>
--- a/mss-ref.docx
+++ b/mss-ref.docx
@@ -2,7 +2,11 @@
 <file path=word/document.xml><?xml version="1.0" encoding="utf-8"?>
 <w:document xmlns:wpc="http://schemas.microsoft.com/office/word/2010/wordprocessingCanvas" xmlns:cx="http://schemas.microsoft.com/office/drawing/2014/chartex" xmlns:cx1="http://schemas.microsoft.com/office/drawing/2015/9/8/chartex" xmlns:cx2="http://schemas.microsoft.com/office/drawing/2015/10/21/chartex" xmlns:cx3="http://schemas.microsoft.com/office/drawing/2016/5/9/chartex" xmlns:cx4="http://schemas.microsoft.com/office/drawing/2016/5/10/chartex" xmlns:cx5="http://schemas.microsoft.com/office/drawing/2016/5/11/chartex" xmlns:cx6="http://schemas.microsoft.com/office/drawing/2016/5/12/chartex" xmlns:cx7="http://schemas.microsoft.com/office/drawing/2016/5/13/chartex" xmlns:cx8="http://schemas.microsoft.com/office/drawing/2016/5/14/chartex" xmlns:mc="http://schemas.openxmlformats.org/markup-compatibility/2006" xmlns:m="http://schemas.openxmlformats.org/officeDocument/2006/math" xmlns:aink="http://schemas.microsoft.com/office/drawing/2016/ink" xmlns:am3d="http://schemas.microsoft.com/office/drawing/2017/model3d" xmlns:oel="http://schemas.microsoft.com/office/2019/extlst" xmlns:r="http://schemas.openxmlformats.org/officeDocument/2006/relationships" xmlns:wp14="http://schemas.microsoft.com/office/word/2010/wordprocessingDrawing" xmlns:wp="http://schemas.openxmlformats.org/drawingml/2006/wordprocessingDrawing" xmlns:wpg="http://schemas.microsoft.com/office/word/2010/wordprocessingGroup" xmlns:wpi="http://schemas.microsoft.com/office/word/2010/wordprocessingInk" xmlns:wps="http://schemas.microsoft.com/office/word/2010/wordprocessingShape" xmlns:o="urn:schemas-microsoft-com:office:office" xmlns:v="urn:schemas-microsoft-com:vml" xmlns:w10="urn:schemas-microsoft-com:office:word" xmlns:w="http://schemas.openxmlformats.org/wordprocessingml/2006/main" xmlns:w14="http://schemas.microsoft.com/office/word/2010/wordml" xmlns:w15="http://schemas.microsoft.com/office/word/2012/wordml" xmlns:w16cex="http://schemas.microsoft.com/office/word/2018/wordml/cex" xmlns:w16cid="http://schemas.microsoft.com/office/word/2016/wordml/cid" xmlns:w16="http://schemas.microsoft.com/office/word/2018/wordml" xmlns:w16sdtdh="http://schemas.microsoft.com/office/word/2020/wordml/sdtdatahash" xmlns:w16sdtfl="http://schemas.microsoft.com/office/word/2024/wordml/sdtformatlock" xmlns:w16se="http://schemas.microsoft.com/office/word/2015/wordml/symex" xmlns:w16du="http://schemas.microsoft.com/office/word/2023/wordml/word16du" xmlns:wne="http://schemas.microsoft.com/office/word/2006/wordml" mc:Ignorable="w14 w15 w16se w16cid w16 w16cex w16sdtdh w16sdtfl w16du wp14">
   <w:body>
-    <w:p/>
+    <w:p>
+      <w:pPr>
+        <w:pStyle w:val="Heading5"/>
+      </w:pPr>
+    </w:p>
     <w:sectPr>
       <w:headerReference w:type="default" r:id="rId7"/>
       <w:headerReference w:type="first" r:id="rId8"/>
@@ -66,10 +70,7 @@
       <w:pStyle w:val="Headerleft"/>
     </w:pPr>
     <w:r>
-      <w:t>Author Name</w:t>
-    </w:r>
-    <w:r>
-      <w:t xml:space="preserve"> / Title / </w:t>
+      <w:t xml:space="preserve">Author Name / Title / </w:t>
     </w:r>
     <w:r>
       <w:fldChar w:fldCharType="begin"/>
@@ -221,7 +222,7 @@
     <w:lsdException w:name="heading 2" w:semiHidden="1" w:uiPriority="9" w:unhideWhenUsed="1" w:qFormat="1"/>
     <w:lsdException w:name="heading 3" w:semiHidden="1" w:uiPriority="9" w:unhideWhenUsed="1" w:qFormat="1"/>
     <w:lsdException w:name="heading 4" w:semiHidden="1" w:uiPriority="9" w:unhideWhenUsed="1" w:qFormat="1"/>
-    <w:lsdException w:name="heading 5" w:semiHidden="1" w:uiPriority="9" w:unhideWhenUsed="1" w:qFormat="1"/>
+    <w:lsdException w:name="heading 5" w:semiHidden="1" w:uiPriority="9" w:unhideWhenUsed="1"/>
     <w:lsdException w:name="heading 6" w:semiHidden="1" w:uiPriority="9" w:unhideWhenUsed="1" w:qFormat="1"/>
     <w:lsdException w:name="heading 7" w:semiHidden="1" w:uiPriority="9" w:unhideWhenUsed="1" w:qFormat="1"/>
     <w:lsdException w:name="heading 8" w:semiHidden="1" w:uiPriority="9" w:unhideWhenUsed="1" w:qFormat="1"/>
@@ -627,6 +628,27 @@
       <w:szCs w:val="29"/>
     </w:rPr>
   </w:style>
+  <w:style w:type="paragraph" w:styleId="Heading5">
+    <w:name w:val="heading 5"/>
+    <w:basedOn w:val="Normal"/>
+    <w:next w:val="Normal"/>
+    <w:link w:val="Heading5Char"/>
+    <w:uiPriority w:val="9"/>
+    <w:unhideWhenUsed/>
+    <w:rsid w:val="003D5537"/>
+    <w:pPr>
+      <w:keepNext/>
+      <w:keepLines/>
+      <w:ind w:firstLine="0"/>
+      <w:jc w:val="center"/>
+      <w:outlineLvl w:val="4"/>
+    </w:pPr>
+    <w:rPr>
+      <w:rFonts w:eastAsiaTheme="majorEastAsia" w:cs="Mangal"/>
+      <w:color w:val="000000" w:themeColor="text1"/>
+      <w:szCs w:val="21"/>
+    </w:rPr>
+  </w:style>
   <w:style w:type="character" w:default="1" w:styleId="DefaultParagraphFont">
     <w:name w:val="Default Paragraph Font"/>
     <w:uiPriority w:val="1"/>
@@ -1001,6 +1023,18 @@
   </w:style>
   <w:style w:type="character" w:customStyle="1" w:styleId="NormalTok">
     <w:name w:val="NormalTok"/>
+  </w:style>
+  <w:style w:type="character" w:customStyle="1" w:styleId="Heading5Char">
+    <w:name w:val="Heading 5 Char"/>
+    <w:basedOn w:val="DefaultParagraphFont"/>
+    <w:link w:val="Heading5"/>
+    <w:uiPriority w:val="9"/>
+    <w:rsid w:val="003D5537"/>
+    <w:rPr>
+      <w:rFonts w:ascii="Times New Roman" w:eastAsiaTheme="majorEastAsia" w:hAnsi="Times New Roman" w:cs="Mangal"/>
+      <w:color w:val="000000" w:themeColor="text1"/>
+      <w:szCs w:val="21"/>
+    </w:rPr>
   </w:style>
 </w:styles>
 </file>

</xml_diff>